<commit_message>
python lambda program, function program 1-11 and provided data
</commit_message>
<xml_diff>
--- a/Sem-2/Python/Python Provided/PYTHON INDICATIVE LIST.docx
+++ b/Sem-2/Python/Python Provided/PYTHON INDICATIVE LIST.docx
@@ -5726,8 +5726,6 @@
         </w:rPr>
         <w:t>i</w:t>
       </w:r>
-      <w:bookmarkStart w:id="0" w:name="_GoBack"/>
-      <w:bookmarkEnd w:id="0"/>
       <w:r>
         <w:rPr>
           <w:rFonts w:ascii="Times New Roman" w:eastAsia="Times New Roman" w:hAnsi="Times New Roman" w:cs="Times New Roman"/>
@@ -6728,7 +6726,25 @@
           <w:szCs w:val="28"/>
           <w:lang w:bidi="en-US"/>
         </w:rPr>
-        <w:t>Take 2 lists and add the elements of it if the 1</w:t>
+        <w:t>Take 2 lists and add the elements of it</w:t>
+      </w:r>
+      <w:r>
+        <w:rPr>
+          <w:rFonts w:ascii="Times New Roman" w:eastAsia="Times New Roman" w:hAnsi="Times New Roman" w:cs="Times New Roman"/>
+          <w:sz w:val="28"/>
+          <w:szCs w:val="28"/>
+          <w:lang w:bidi="en-US"/>
+        </w:rPr>
+        <w:t>.</w:t>
+      </w:r>
+      <w:r>
+        <w:rPr>
+          <w:rFonts w:ascii="Times New Roman" w:eastAsia="Times New Roman" w:hAnsi="Times New Roman" w:cs="Times New Roman"/>
+          <w:sz w:val="28"/>
+          <w:szCs w:val="28"/>
+          <w:lang w:bidi="en-US"/>
+        </w:rPr>
+        <w:t xml:space="preserve"> if the 1</w:t>
       </w:r>
       <w:r>
         <w:rPr>
@@ -6747,7 +6763,27 @@
           <w:szCs w:val="28"/>
           <w:lang w:bidi="en-US"/>
         </w:rPr>
-        <w:t xml:space="preserve"> number is greater than the other else find the difference between them</w:t>
+        <w:t xml:space="preserve"> number is greater than the other</w:t>
+      </w:r>
+      <w:r>
+        <w:rPr>
+          <w:rFonts w:ascii="Times New Roman" w:eastAsia="Times New Roman" w:hAnsi="Times New Roman" w:cs="Times New Roman"/>
+          <w:sz w:val="28"/>
+          <w:szCs w:val="28"/>
+          <w:lang w:bidi="en-US"/>
+        </w:rPr>
+        <w:t>,</w:t>
+      </w:r>
+      <w:bookmarkStart w:id="0" w:name="_GoBack"/>
+      <w:bookmarkEnd w:id="0"/>
+      <w:r>
+        <w:rPr>
+          <w:rFonts w:ascii="Times New Roman" w:eastAsia="Times New Roman" w:hAnsi="Times New Roman" w:cs="Times New Roman"/>
+          <w:sz w:val="28"/>
+          <w:szCs w:val="28"/>
+          <w:lang w:bidi="en-US"/>
+        </w:rPr>
+        <w:t xml:space="preserve"> find the difference between them</w:t>
       </w:r>
     </w:p>
     <w:p>
@@ -17441,7 +17477,7 @@
 </file>
 
 <file path=customXml/itemProps1.xml><?xml version="1.0" encoding="utf-8"?>
-<ds:datastoreItem xmlns:ds="http://schemas.openxmlformats.org/officeDocument/2006/customXml" ds:itemID="{58F82A8A-72FD-4265-8DC4-A4B4C4C67197}">
+<ds:datastoreItem xmlns:ds="http://schemas.openxmlformats.org/officeDocument/2006/customXml" ds:itemID="{0C17FF27-E0BC-4738-9677-B373836ADDEB}">
   <ds:schemaRefs>
     <ds:schemaRef ds:uri="http://schemas.openxmlformats.org/officeDocument/2006/bibliography"/>
   </ds:schemaRefs>

</xml_diff>